<commit_message>
docs: 用 deepseek-v4-pro 重绘 6 张示意图(SVG 矢量 + Chrome 高清渲染)
- 新增 gen_diagrams_v4.py:调用 deepseek-v4-pro(Anthropic 兼容接口)生成 SVG,严格布局约束(越界/溢出/节点齐全全通过)
- 新增 validate_diagrams.py:程序化校验 SVG XML/元素越界/文字溢出/PNG 密度
- img/*.png 全部替换为高清版(2x,渐变色/圆角/阴影/箭头 marker),含 SVG 源文件
- 修复 deploy.svg XML 注释 -- 非法问题;修 md2docx 图片重嵌

Co-Authored-By: Claude <noreply@anthropic.com>
</commit_message>
<xml_diff>
--- a/docs/智能体设计说明书.docx
+++ b/docs/智能体设计说明书.docx
@@ -3072,7 +3072,7 @@
       <w:r>
         <w:drawing>
           <wp:inline xmlns:a="http://schemas.openxmlformats.org/drawingml/2006/main" xmlns:pic="http://schemas.openxmlformats.org/drawingml/2006/picture">
-            <wp:extent cx="5400000" cy="3052174"/>
+            <wp:extent cx="5400000" cy="2934783"/>
             <wp:docPr id="2" name="Picture 2"/>
             <wp:cNvGraphicFramePr>
               <a:graphicFrameLocks noChangeAspect="1"/>
@@ -3093,7 +3093,7 @@
                   <pic:spPr>
                     <a:xfrm>
                       <a:off x="0" y="0"/>
-                      <a:ext cx="5400000" cy="3052174"/>
+                      <a:ext cx="5400000" cy="2934783"/>
                     </a:xfrm>
                     <a:prstGeom prst="rect"/>
                   </pic:spPr>
@@ -3334,7 +3334,7 @@
       <w:r>
         <w:drawing>
           <wp:inline xmlns:a="http://schemas.openxmlformats.org/drawingml/2006/main" xmlns:pic="http://schemas.openxmlformats.org/drawingml/2006/picture">
-            <wp:extent cx="4320000" cy="5629092"/>
+            <wp:extent cx="4320000" cy="5890909"/>
             <wp:docPr id="4" name="Picture 4"/>
             <wp:cNvGraphicFramePr>
               <a:graphicFrameLocks noChangeAspect="1"/>
@@ -3355,7 +3355,7 @@
                   <pic:spPr>
                     <a:xfrm>
                       <a:off x="0" y="0"/>
-                      <a:ext cx="4320000" cy="5629092"/>
+                      <a:ext cx="4320000" cy="5890909"/>
                     </a:xfrm>
                     <a:prstGeom prst="rect"/>
                   </pic:spPr>
@@ -3394,7 +3394,7 @@
       <w:r>
         <w:drawing>
           <wp:inline xmlns:a="http://schemas.openxmlformats.org/drawingml/2006/main" xmlns:pic="http://schemas.openxmlformats.org/drawingml/2006/picture">
-            <wp:extent cx="5400000" cy="4547368"/>
+            <wp:extent cx="5400000" cy="4292308"/>
             <wp:docPr id="5" name="Picture 5"/>
             <wp:cNvGraphicFramePr>
               <a:graphicFrameLocks noChangeAspect="1"/>
@@ -3415,7 +3415,7 @@
                   <pic:spPr>
                     <a:xfrm>
                       <a:off x="0" y="0"/>
-                      <a:ext cx="5400000" cy="4547368"/>
+                      <a:ext cx="5400000" cy="4292308"/>
                     </a:xfrm>
                     <a:prstGeom prst="rect"/>
                   </pic:spPr>
@@ -8571,7 +8571,7 @@
       <w:r>
         <w:drawing>
           <wp:inline xmlns:a="http://schemas.openxmlformats.org/drawingml/2006/main" xmlns:pic="http://schemas.openxmlformats.org/drawingml/2006/picture">
-            <wp:extent cx="5400000" cy="2557895"/>
+            <wp:extent cx="5400000" cy="2700000"/>
             <wp:docPr id="6" name="Picture 6"/>
             <wp:cNvGraphicFramePr>
               <a:graphicFrameLocks noChangeAspect="1"/>
@@ -8592,7 +8592,7 @@
                   <pic:spPr>
                     <a:xfrm>
                       <a:off x="0" y="0"/>
-                      <a:ext cx="5400000" cy="2557895"/>
+                      <a:ext cx="5400000" cy="2700000"/>
                     </a:xfrm>
                     <a:prstGeom prst="rect"/>
                   </pic:spPr>

</xml_diff>